<commit_message>
Tłumaczenia gier GMT: nawiasy EN w SPQR, nagłówki TS jak Phalanx, łatki BB, poprawka dzielenia wyrazów, raport aktualny
Co-Authored-By: Claude Opus 5.5 <noreply@anthropic.com>
Claude-Session: https://claude.ai/code/session_011F5uiw9gW8cnnoXX25MovS
</commit_message>
<xml_diff>
--- a/tlumaczenia_gier/Twilight_Struggle/TS_20th_Ann_Rule_Book_WEB_PL.docx
+++ b/tlumaczenia_gier/Twilight_Struggle/TS_20th_Ann_Rule_Book_WEB_PL.docx
@@ -51,7 +51,7 @@
         <w:pStyle w:val="Compact"/>
       </w:pPr>
       <w:r>
-        <w:t xml:space="preserve">2.0 Elementy gry (Components) – 2</w:t>
+        <w:t xml:space="preserve">2.0 Komponenty (Components) – 2</w:t>
       </w:r>
     </w:p>
     <w:p>
@@ -63,7 +63,7 @@
         <w:pStyle w:val="Compact"/>
       </w:pPr>
       <w:r>
-        <w:t xml:space="preserve">3.0 Przygotowanie gry (Game Setup) – 6</w:t>
+        <w:t xml:space="preserve">3.0 Przygotowanie rozgrywki (Game Setup) – 6</w:t>
       </w:r>
     </w:p>
     <w:p>
@@ -75,7 +75,7 @@
         <w:pStyle w:val="Compact"/>
       </w:pPr>
       <w:r>
-        <w:t xml:space="preserve">4.0 Przebieg gry (Game Sequence) – 8</w:t>
+        <w:t xml:space="preserve">4.0 Przebieg rozgrywki (Game Sequence) – 8</w:t>
       </w:r>
     </w:p>
     <w:p>
@@ -123,7 +123,7 @@
         <w:pStyle w:val="Compact"/>
       </w:pPr>
       <w:r>
-        <w:t xml:space="preserve">8.0 Status DEFCON i Operacje Wojskowe (DEFCON Status and Military Operations) – 14</w:t>
+        <w:t xml:space="preserve">8.0 Status DEFCON oraz Operacje Wojskowe (DEFCON Status and Military Operations) – 14</w:t>
       </w:r>
     </w:p>
     <w:p>
@@ -135,7 +135,7 @@
         <w:pStyle w:val="Compact"/>
       </w:pPr>
       <w:r>
-        <w:t xml:space="preserve">9.0 Chiny (China) – 15</w:t>
+        <w:t xml:space="preserve">9.0 Karta Chińska (China) – 15</w:t>
       </w:r>
     </w:p>
     <w:p>
@@ -147,7 +147,7 @@
         <w:pStyle w:val="Compact"/>
       </w:pPr>
       <w:r>
-        <w:t xml:space="preserve">10.0 Rozstrzygnięcie i zwycięstwo (Scoring and Victory) – 16</w:t>
+        <w:t xml:space="preserve">10.0 Rozstrzygnięcie i warunki zwycięstwa (Scoring and Victory) – 16</w:t>
       </w:r>
     </w:p>
     <w:p>
@@ -452,7 +452,7 @@
         <w:pStyle w:val="Heading2"/>
       </w:pPr>
       <w:r>
-        <w:t xml:space="preserve">2.0 ELEMENTY GRY (COMPONENTS)</w:t>
+        <w:t xml:space="preserve">2.0 KOMPONENTY (COMPONENTS)</w:t>
       </w:r>
     </w:p>
     <w:p>
@@ -767,7 +767,7 @@
         <w:pStyle w:val="Heading2"/>
       </w:pPr>
       <w:r>
-        <w:t xml:space="preserve">2.1 MAPA GRY (THE GAME MAP)</w:t>
+        <w:t xml:space="preserve">2.1 PLANSZA (THE GAME MAP)</w:t>
       </w:r>
     </w:p>
     <w:p>
@@ -1048,7 +1048,7 @@
           <w:bCs/>
           <w:b/>
         </w:rPr>
-        <w:t xml:space="preserve">2.1.7 Kontrolowanie państw (Controlling Countries):</w:t>
+        <w:t xml:space="preserve">2.1.7 Kontrolowanie państwa (Controlling Countries):</w:t>
       </w:r>
       <w:r>
         <w:t xml:space="preserve"> </w:t>
@@ -1526,7 +1526,7 @@
         <w:pStyle w:val="Heading2"/>
       </w:pPr>
       <w:r>
-        <w:t xml:space="preserve">3.0 PRZYGOTOWANIE GRY (GAME SETUP)</w:t>
+        <w:t xml:space="preserve">3.0 PRZYGOTOWANIE ROZGRYWKI (GAME SETUP)</w:t>
       </w:r>
     </w:p>
     <w:p>
@@ -1675,7 +1675,7 @@
         <w:pStyle w:val="Heading2"/>
       </w:pPr>
       <w:r>
-        <w:t xml:space="preserve">4.0 PRZEBIEG GRY (GAME SEQUENCE)</w:t>
+        <w:t xml:space="preserve">4.0 PRZEBIEG ROZGRYWKI (GAME SEQUENCE)</w:t>
       </w:r>
     </w:p>
     <w:p>
@@ -3158,7 +3158,7 @@
         <w:pStyle w:val="Heading2"/>
       </w:pPr>
       <w:r>
-        <w:t xml:space="preserve">6.2 RZUTY NA WYWIERANIE PRESJI (REALIGNMENT ROLLS)</w:t>
+        <w:t xml:space="preserve">6.2 WYWIERANIE PRESJI (REALIGNMENT ROLLS)</w:t>
       </w:r>
     </w:p>
     <w:p>
@@ -3278,7 +3278,7 @@
         <w:pStyle w:val="Heading2"/>
       </w:pPr>
       <w:r>
-        <w:t xml:space="preserve">6.3 PRÓBY PRZEWROTU (COUP ATTEMPTS)</w:t>
+        <w:t xml:space="preserve">6.3 PRZEWROTY (COUP ATTEMPTS)</w:t>
       </w:r>
     </w:p>
     <w:p>
@@ -4504,7 +4504,7 @@
         <w:pStyle w:val="Heading2"/>
       </w:pPr>
       <w:r>
-        <w:t xml:space="preserve">8.0 STATUS DEFCON I OPERACJE WOJSKOWE (DEFCON STATUS AND MILITARY OPERATIONS)</w:t>
+        <w:t xml:space="preserve">8.0 STATUS DEFCON ORAZ OPERACJE WOJSKOWE (DEFCON STATUS AND MILITARY OPERATIONS)</w:t>
       </w:r>
     </w:p>
     <w:p>
@@ -5108,7 +5108,7 @@
         <w:pStyle w:val="Heading2"/>
       </w:pPr>
       <w:r>
-        <w:t xml:space="preserve">9.0 CHINY (CHINA)</w:t>
+        <w:t xml:space="preserve">9.0 KARTA CHIŃSKA (CHINA)</w:t>
       </w:r>
     </w:p>
     <w:p>
@@ -5455,7 +5455,7 @@
         <w:pStyle w:val="Heading2"/>
       </w:pPr>
       <w:r>
-        <w:t xml:space="preserve">10.0 ROZSTRZYGNIĘCIE I ZWYCIĘSTWO (SCORING AND VICTORY)</w:t>
+        <w:t xml:space="preserve">10.0 ROZSTRZYGNIĘCIE I WARUNKI ZWYCIĘSTWA (SCORING AND VICTORY)</w:t>
       </w:r>
     </w:p>
     <w:p>
@@ -5557,7 +5557,7 @@
         <w:pStyle w:val="Heading2"/>
       </w:pPr>
       <w:r>
-        <w:t xml:space="preserve">10.1 ROZSTRZYGNIĘCIE (SCORING)</w:t>
+        <w:t xml:space="preserve">10.1 ROZSTRZYGNIĘCIA (SCORING)</w:t>
       </w:r>
     </w:p>
     <w:p>
@@ -5856,7 +5856,7 @@
         <w:pStyle w:val="Heading2"/>
       </w:pPr>
       <w:r>
-        <w:t xml:space="preserve">10.3 ZWYCIĘSTWO (VICTORY)</w:t>
+        <w:t xml:space="preserve">10.3 WARUNKI ZWYCIĘSTWA (VICTORY)</w:t>
       </w:r>
     </w:p>
     <w:p>
@@ -6012,7 +6012,7 @@
         <w:pStyle w:val="Heading2"/>
       </w:pPr>
       <w:r>
-        <w:t xml:space="preserve">11.1 Pole Chińska wojna domowa (The Chinese Civil War space)</w:t>
+        <w:t xml:space="preserve">11.1 Pole „Chińska wojna domowa” (The Chinese Civil War space)</w:t>
       </w:r>
     </w:p>
     <w:p>
@@ -6083,7 +6083,7 @@
         <w:pStyle w:val="Heading2"/>
       </w:pPr>
       <w:r>
-        <w:t xml:space="preserve">11.3 Skutki Kontroli (Impact of Control)</w:t>
+        <w:t xml:space="preserve">11.3 Skutki Kontroli pola (Impact of Control)</w:t>
       </w:r>
     </w:p>
     <w:p>
@@ -6129,7 +6129,7 @@
         <w:pStyle w:val="Heading2"/>
       </w:pPr>
       <w:r>
-        <w:t xml:space="preserve">11.4 Ograniczenia Wydarzeń (Event Restrictions)</w:t>
+        <w:t xml:space="preserve">11.4 Ograniczenie Wydarzeń (Event Restrictions)</w:t>
       </w:r>
     </w:p>
     <w:p>
@@ -6930,7 +6930,7 @@
         <w:pStyle w:val="Heading2"/>
       </w:pPr>
       <w:r>
-        <w:t xml:space="preserve">13.3 Opcjonalne zasady projektantów (Designers’ Optional Rules)</w:t>
+        <w:t xml:space="preserve">13.3 Opcjonalne zasady autorów (Designers’ Optional Rules)</w:t>
       </w:r>
     </w:p>
     <w:p>
@@ -6950,7 +6950,7 @@
         <w:pStyle w:val="Heading3"/>
       </w:pPr>
       <w:r>
-        <w:t xml:space="preserve">Rzuty na Wywieranie Presji (Realignment Rolls)</w:t>
+        <w:t xml:space="preserve">Wywieranie Presji (Realignment Rolls)</w:t>
       </w:r>
     </w:p>
     <w:p>
@@ -7648,7 +7648,7 @@
         <w:pStyle w:val="Heading3"/>
       </w:pPr>
       <w:r>
-        <w:t xml:space="preserve">Zwycięstwo (Victory)</w:t>
+        <w:t xml:space="preserve">Warunki zwycięstwa (Victory)</w:t>
       </w:r>
     </w:p>
     <w:p>

</xml_diff>